<commit_message>
Update Word document templates (Quote, OTTO, Thermal)
Incorporates latest formatting and content revisions to all three
.docx templates used by the document generator.

Co-Authored-By: Claude Sonnet 4.6 <noreply@anthropic.com>
</commit_message>
<xml_diff>
--- a/otto_template.docx
+++ b/otto_template.docx
@@ -350,7 +350,6 @@
                                 <w:szCs w:val="32"/>
                               </w:rPr>
                             </w:pPr>
-                            <w:proofErr w:type="gramStart"/>
                             <w:r>
                               <w:rPr>
                                 <w:rFonts w:ascii="Aptos" w:eastAsia="Aptos" w:hAnsi="Aptos" w:cs="Aptos"/>
@@ -360,67 +359,7 @@
                                 <w:sz w:val="32"/>
                                 <w:szCs w:val="32"/>
                               </w:rPr>
-                              <w:t xml:space="preserve">{{ </w:t>
-                            </w:r>
-                            <w:proofErr w:type="spellStart"/>
-                            <w:r>
-                              <w:rPr>
-                                <w:rFonts w:ascii="Aptos" w:eastAsia="Aptos" w:hAnsi="Aptos" w:cs="Aptos"/>
-                                <w:b/>
-                                <w:bCs/>
-                                <w:color w:val="9E1B32"/>
-                                <w:sz w:val="32"/>
-                                <w:szCs w:val="32"/>
-                              </w:rPr>
-                              <w:t>customer</w:t>
-                            </w:r>
-                            <w:proofErr w:type="gramEnd"/>
-                            <w:r>
-                              <w:rPr>
-                                <w:rFonts w:ascii="Aptos" w:eastAsia="Aptos" w:hAnsi="Aptos" w:cs="Aptos"/>
-                                <w:b/>
-                                <w:bCs/>
-                                <w:color w:val="9E1B32"/>
-                                <w:sz w:val="32"/>
-                                <w:szCs w:val="32"/>
-                              </w:rPr>
-                              <w:t>_</w:t>
-                            </w:r>
-                            <w:proofErr w:type="gramStart"/>
-                            <w:r>
-                              <w:rPr>
-                                <w:rFonts w:ascii="Aptos" w:eastAsia="Aptos" w:hAnsi="Aptos" w:cs="Aptos"/>
-                                <w:b/>
-                                <w:bCs/>
-                                <w:color w:val="9E1B32"/>
-                                <w:sz w:val="32"/>
-                                <w:szCs w:val="32"/>
-                              </w:rPr>
-                              <w:t>picture</w:t>
-                            </w:r>
-                            <w:proofErr w:type="spellEnd"/>
-                            <w:r>
-                              <w:rPr>
-                                <w:rFonts w:ascii="Aptos" w:eastAsia="Aptos" w:hAnsi="Aptos" w:cs="Aptos"/>
-                                <w:b/>
-                                <w:bCs/>
-                                <w:color w:val="9E1B32"/>
-                                <w:sz w:val="32"/>
-                                <w:szCs w:val="32"/>
-                              </w:rPr>
-                              <w:t xml:space="preserve"> }</w:t>
-                            </w:r>
-                            <w:proofErr w:type="gramEnd"/>
-                            <w:r>
-                              <w:rPr>
-                                <w:rFonts w:ascii="Aptos" w:eastAsia="Aptos" w:hAnsi="Aptos" w:cs="Aptos"/>
-                                <w:b/>
-                                <w:bCs/>
-                                <w:color w:val="9E1B32"/>
-                                <w:sz w:val="32"/>
-                                <w:szCs w:val="32"/>
-                              </w:rPr>
-                              <w:t>}</w:t>
+                              <w:t>{{ customer_picture }}</w:t>
                             </w:r>
                           </w:p>
                         </w:txbxContent>
@@ -476,7 +415,6 @@
                           <w:szCs w:val="32"/>
                         </w:rPr>
                       </w:pPr>
-                      <w:proofErr w:type="gramStart"/>
                       <w:r>
                         <w:rPr>
                           <w:rFonts w:ascii="Aptos" w:eastAsia="Aptos" w:hAnsi="Aptos" w:cs="Aptos"/>
@@ -486,67 +424,7 @@
                           <w:sz w:val="32"/>
                           <w:szCs w:val="32"/>
                         </w:rPr>
-                        <w:t xml:space="preserve">{{ </w:t>
-                      </w:r>
-                      <w:proofErr w:type="spellStart"/>
-                      <w:r>
-                        <w:rPr>
-                          <w:rFonts w:ascii="Aptos" w:eastAsia="Aptos" w:hAnsi="Aptos" w:cs="Aptos"/>
-                          <w:b/>
-                          <w:bCs/>
-                          <w:color w:val="9E1B32"/>
-                          <w:sz w:val="32"/>
-                          <w:szCs w:val="32"/>
-                        </w:rPr>
-                        <w:t>customer</w:t>
-                      </w:r>
-                      <w:proofErr w:type="gramEnd"/>
-                      <w:r>
-                        <w:rPr>
-                          <w:rFonts w:ascii="Aptos" w:eastAsia="Aptos" w:hAnsi="Aptos" w:cs="Aptos"/>
-                          <w:b/>
-                          <w:bCs/>
-                          <w:color w:val="9E1B32"/>
-                          <w:sz w:val="32"/>
-                          <w:szCs w:val="32"/>
-                        </w:rPr>
-                        <w:t>_</w:t>
-                      </w:r>
-                      <w:proofErr w:type="gramStart"/>
-                      <w:r>
-                        <w:rPr>
-                          <w:rFonts w:ascii="Aptos" w:eastAsia="Aptos" w:hAnsi="Aptos" w:cs="Aptos"/>
-                          <w:b/>
-                          <w:bCs/>
-                          <w:color w:val="9E1B32"/>
-                          <w:sz w:val="32"/>
-                          <w:szCs w:val="32"/>
-                        </w:rPr>
-                        <w:t>picture</w:t>
-                      </w:r>
-                      <w:proofErr w:type="spellEnd"/>
-                      <w:r>
-                        <w:rPr>
-                          <w:rFonts w:ascii="Aptos" w:eastAsia="Aptos" w:hAnsi="Aptos" w:cs="Aptos"/>
-                          <w:b/>
-                          <w:bCs/>
-                          <w:color w:val="9E1B32"/>
-                          <w:sz w:val="32"/>
-                          <w:szCs w:val="32"/>
-                        </w:rPr>
-                        <w:t xml:space="preserve"> }</w:t>
-                      </w:r>
-                      <w:proofErr w:type="gramEnd"/>
-                      <w:r>
-                        <w:rPr>
-                          <w:rFonts w:ascii="Aptos" w:eastAsia="Aptos" w:hAnsi="Aptos" w:cs="Aptos"/>
-                          <w:b/>
-                          <w:bCs/>
-                          <w:color w:val="9E1B32"/>
-                          <w:sz w:val="32"/>
-                          <w:szCs w:val="32"/>
-                        </w:rPr>
-                        <w:t>}</w:t>
+                        <w:t>{{ customer_picture }}</w:t>
                       </w:r>
                     </w:p>
                   </w:txbxContent>
@@ -1078,14 +956,6 @@
                                 <w:sz w:val="40"/>
                                 <w:szCs w:val="40"/>
                               </w:rPr>
-                              <w:t xml:space="preserve">Budgetary </w:t>
-                            </w:r>
-                            <w:r>
-                              <w:rPr>
-                                <w:rFonts w:ascii="Aptos Narrow" w:hAnsi="Aptos Narrow"/>
-                                <w:sz w:val="40"/>
-                                <w:szCs w:val="40"/>
-                              </w:rPr>
                               <w:t>Quote</w:t>
                             </w:r>
                           </w:p>
@@ -1140,14 +1010,6 @@
                           <w:szCs w:val="40"/>
                         </w:rPr>
                       </w:pPr>
-                      <w:r>
-                        <w:rPr>
-                          <w:rFonts w:ascii="Aptos Narrow" w:hAnsi="Aptos Narrow"/>
-                          <w:sz w:val="40"/>
-                          <w:szCs w:val="40"/>
-                        </w:rPr>
-                        <w:t xml:space="preserve">Budgetary </w:t>
-                      </w:r>
                       <w:r>
                         <w:rPr>
                           <w:rFonts w:ascii="Aptos Narrow" w:hAnsi="Aptos Narrow"/>
@@ -1879,23 +1741,7 @@
                                 <w:rFonts w:ascii="Aptos Narrow" w:hAnsi="Aptos Narrow"/>
                                 <w:color w:val="FFFFFF" w:themeColor="background1"/>
                               </w:rPr>
-                              <w:t>{{</w:t>
-                            </w:r>
-                            <w:proofErr w:type="spellStart"/>
-                            <w:r>
-                              <w:rPr>
-                                <w:rFonts w:ascii="Aptos Narrow" w:hAnsi="Aptos Narrow"/>
-                                <w:color w:val="FFFFFF" w:themeColor="background1"/>
-                              </w:rPr>
-                              <w:t>pres_name</w:t>
-                            </w:r>
-                            <w:proofErr w:type="spellEnd"/>
-                            <w:r>
-                              <w:rPr>
-                                <w:rFonts w:ascii="Aptos Narrow" w:hAnsi="Aptos Narrow"/>
-                                <w:color w:val="FFFFFF" w:themeColor="background1"/>
-                              </w:rPr>
-                              <w:t>}}</w:t>
+                              <w:t>{{pres_name}}</w:t>
                             </w:r>
                             <w:r>
                               <w:rPr>
@@ -1926,23 +1772,7 @@
                                 <w:rFonts w:ascii="Aptos Narrow" w:hAnsi="Aptos Narrow"/>
                                 <w:color w:val="FFFFFF" w:themeColor="background1"/>
                               </w:rPr>
-                              <w:t>{{</w:t>
-                            </w:r>
-                            <w:proofErr w:type="spellStart"/>
-                            <w:r>
-                              <w:rPr>
-                                <w:rFonts w:ascii="Aptos Narrow" w:hAnsi="Aptos Narrow"/>
-                                <w:color w:val="FFFFFF" w:themeColor="background1"/>
-                              </w:rPr>
-                              <w:t>pres_email</w:t>
-                            </w:r>
-                            <w:proofErr w:type="spellEnd"/>
-                            <w:r>
-                              <w:rPr>
-                                <w:rFonts w:ascii="Aptos Narrow" w:hAnsi="Aptos Narrow"/>
-                                <w:color w:val="FFFFFF" w:themeColor="background1"/>
-                              </w:rPr>
-                              <w:t>}}</w:t>
+                              <w:t>{{pres_email}}</w:t>
                             </w:r>
                             <w:r>
                               <w:rPr>
@@ -1957,23 +1787,7 @@
                                 <w:color w:val="FFFFFF" w:themeColor="background1"/>
                               </w:rPr>
                               <w:br/>
-                              <w:t>{{</w:t>
-                            </w:r>
-                            <w:proofErr w:type="spellStart"/>
-                            <w:r>
-                              <w:rPr>
-                                <w:rFonts w:ascii="Aptos Narrow" w:hAnsi="Aptos Narrow"/>
-                                <w:color w:val="FFFFFF" w:themeColor="background1"/>
-                              </w:rPr>
-                              <w:t>acct_name</w:t>
-                            </w:r>
-                            <w:proofErr w:type="spellEnd"/>
-                            <w:r>
-                              <w:rPr>
-                                <w:rFonts w:ascii="Aptos Narrow" w:hAnsi="Aptos Narrow"/>
-                                <w:color w:val="FFFFFF" w:themeColor="background1"/>
-                              </w:rPr>
-                              <w:t>}}</w:t>
+                              <w:t>{{acct_name}}</w:t>
                             </w:r>
                             <w:r>
                               <w:rPr>
@@ -1996,23 +1810,7 @@
                                 <w:color w:val="FFFFFF" w:themeColor="background1"/>
                               </w:rPr>
                               <w:br/>
-                              <w:t>{{</w:t>
-                            </w:r>
-                            <w:proofErr w:type="spellStart"/>
-                            <w:r>
-                              <w:rPr>
-                                <w:rFonts w:ascii="Aptos Narrow" w:hAnsi="Aptos Narrow"/>
-                                <w:color w:val="FFFFFF" w:themeColor="background1"/>
-                              </w:rPr>
-                              <w:t>acct_email</w:t>
-                            </w:r>
-                            <w:proofErr w:type="spellEnd"/>
-                            <w:r>
-                              <w:rPr>
-                                <w:rFonts w:ascii="Aptos Narrow" w:hAnsi="Aptos Narrow"/>
-                                <w:color w:val="FFFFFF" w:themeColor="background1"/>
-                              </w:rPr>
-                              <w:t>}}</w:t>
+                              <w:t>{{acct_email}}</w:t>
                             </w:r>
                           </w:p>
                         </w:txbxContent>
@@ -2126,23 +1924,7 @@
                           <w:rFonts w:ascii="Aptos Narrow" w:hAnsi="Aptos Narrow"/>
                           <w:color w:val="FFFFFF" w:themeColor="background1"/>
                         </w:rPr>
-                        <w:t>{{</w:t>
-                      </w:r>
-                      <w:proofErr w:type="spellStart"/>
-                      <w:r>
-                        <w:rPr>
-                          <w:rFonts w:ascii="Aptos Narrow" w:hAnsi="Aptos Narrow"/>
-                          <w:color w:val="FFFFFF" w:themeColor="background1"/>
-                        </w:rPr>
-                        <w:t>pres_name</w:t>
-                      </w:r>
-                      <w:proofErr w:type="spellEnd"/>
-                      <w:r>
-                        <w:rPr>
-                          <w:rFonts w:ascii="Aptos Narrow" w:hAnsi="Aptos Narrow"/>
-                          <w:color w:val="FFFFFF" w:themeColor="background1"/>
-                        </w:rPr>
-                        <w:t>}}</w:t>
+                        <w:t>{{pres_name}}</w:t>
                       </w:r>
                       <w:r>
                         <w:rPr>
@@ -2173,23 +1955,7 @@
                           <w:rFonts w:ascii="Aptos Narrow" w:hAnsi="Aptos Narrow"/>
                           <w:color w:val="FFFFFF" w:themeColor="background1"/>
                         </w:rPr>
-                        <w:t>{{</w:t>
-                      </w:r>
-                      <w:proofErr w:type="spellStart"/>
-                      <w:r>
-                        <w:rPr>
-                          <w:rFonts w:ascii="Aptos Narrow" w:hAnsi="Aptos Narrow"/>
-                          <w:color w:val="FFFFFF" w:themeColor="background1"/>
-                        </w:rPr>
-                        <w:t>pres_email</w:t>
-                      </w:r>
-                      <w:proofErr w:type="spellEnd"/>
-                      <w:r>
-                        <w:rPr>
-                          <w:rFonts w:ascii="Aptos Narrow" w:hAnsi="Aptos Narrow"/>
-                          <w:color w:val="FFFFFF" w:themeColor="background1"/>
-                        </w:rPr>
-                        <w:t>}}</w:t>
+                        <w:t>{{pres_email}}</w:t>
                       </w:r>
                       <w:r>
                         <w:rPr>
@@ -2204,23 +1970,7 @@
                           <w:color w:val="FFFFFF" w:themeColor="background1"/>
                         </w:rPr>
                         <w:br/>
-                        <w:t>{{</w:t>
-                      </w:r>
-                      <w:proofErr w:type="spellStart"/>
-                      <w:r>
-                        <w:rPr>
-                          <w:rFonts w:ascii="Aptos Narrow" w:hAnsi="Aptos Narrow"/>
-                          <w:color w:val="FFFFFF" w:themeColor="background1"/>
-                        </w:rPr>
-                        <w:t>acct_name</w:t>
-                      </w:r>
-                      <w:proofErr w:type="spellEnd"/>
-                      <w:r>
-                        <w:rPr>
-                          <w:rFonts w:ascii="Aptos Narrow" w:hAnsi="Aptos Narrow"/>
-                          <w:color w:val="FFFFFF" w:themeColor="background1"/>
-                        </w:rPr>
-                        <w:t>}}</w:t>
+                        <w:t>{{acct_name}}</w:t>
                       </w:r>
                       <w:r>
                         <w:rPr>
@@ -2243,23 +1993,7 @@
                           <w:color w:val="FFFFFF" w:themeColor="background1"/>
                         </w:rPr>
                         <w:br/>
-                        <w:t>{{</w:t>
-                      </w:r>
-                      <w:proofErr w:type="spellStart"/>
-                      <w:r>
-                        <w:rPr>
-                          <w:rFonts w:ascii="Aptos Narrow" w:hAnsi="Aptos Narrow"/>
-                          <w:color w:val="FFFFFF" w:themeColor="background1"/>
-                        </w:rPr>
-                        <w:t>acct_email</w:t>
-                      </w:r>
-                      <w:proofErr w:type="spellEnd"/>
-                      <w:r>
-                        <w:rPr>
-                          <w:rFonts w:ascii="Aptos Narrow" w:hAnsi="Aptos Narrow"/>
-                          <w:color w:val="FFFFFF" w:themeColor="background1"/>
-                        </w:rPr>
-                        <w:t>}}</w:t>
+                        <w:t>{{acct_email}}</w:t>
                       </w:r>
                     </w:p>
                   </w:txbxContent>
@@ -2270,8 +2004,8 @@
           </mc:Fallback>
         </mc:AlternateContent>
       </w:r>
-      <w:bookmarkStart w:id="1" w:name="_Hlk170824948"/>
-      <w:bookmarkEnd w:id="1"/>
+      <w:bookmarkStart w:id="2" w:name="_Hlk170824948"/>
+      <w:bookmarkEnd w:id="2"/>
     </w:p>
     <w:p>
       <w:pPr>
@@ -3451,11 +3185,11 @@
           <w:szCs w:val="32"/>
         </w:rPr>
       </w:pPr>
-      <w:bookmarkStart w:id="2" w:name="_tocs1"/>
-      <w:bookmarkStart w:id="3" w:name="_tocs2"/>
-      <w:bookmarkStart w:id="4" w:name="_Toc226359950"/>
-      <w:bookmarkStart w:id="5" w:name="_Toc227134780"/>
-      <w:bookmarkEnd w:id="2"/>
+      <w:bookmarkStart w:id="3" w:name="_tocs1"/>
+      <w:bookmarkStart w:id="4" w:name="_tocs2"/>
+      <w:bookmarkStart w:id="5" w:name="_Toc226359950"/>
+      <w:bookmarkStart w:id="6" w:name="_Toc227134780"/>
+      <w:bookmarkEnd w:id="3"/>
       <w:r>
         <w:rPr>
           <w:rFonts w:ascii="Aptos" w:hAnsi="Aptos"/>
@@ -3497,9 +3231,9 @@
         </w:rPr>
         <w:t>Bill of Material</w:t>
       </w:r>
-      <w:bookmarkEnd w:id="3"/>
       <w:bookmarkEnd w:id="4"/>
       <w:bookmarkEnd w:id="5"/>
+      <w:bookmarkEnd w:id="6"/>
     </w:p>
     <w:p>
       <w:pPr>
@@ -3639,21 +3373,7 @@
               <w:rPr>
                 <w:rFonts w:ascii="Aptos" w:hAnsi="Aptos"/>
               </w:rPr>
-              <w:t xml:space="preserve">027683 - OTTO 1500 Autonomous </w:t>
-            </w:r>
-            <w:proofErr w:type="gramStart"/>
-            <w:r>
-              <w:rPr>
-                <w:rFonts w:ascii="Aptos" w:hAnsi="Aptos"/>
-              </w:rPr>
-              <w:t>High Speed</w:t>
-            </w:r>
-            <w:proofErr w:type="gramEnd"/>
-            <w:r>
-              <w:rPr>
-                <w:rFonts w:ascii="Aptos" w:hAnsi="Aptos"/>
-              </w:rPr>
-              <w:t xml:space="preserve"> Chargin Station - NA 480V</w:t>
+              <w:t>027683 - OTTO 1500 Autonomous High Speed Chargin Station - NA 480V</w:t>
             </w:r>
           </w:p>
         </w:tc>
@@ -3911,9 +3631,9 @@
           <w:szCs w:val="32"/>
         </w:rPr>
       </w:pPr>
-      <w:bookmarkStart w:id="6" w:name="_tocss9"/>
-      <w:bookmarkStart w:id="7" w:name="_Toc226359951"/>
-      <w:bookmarkStart w:id="8" w:name="_Toc227134781"/>
+      <w:bookmarkStart w:id="7" w:name="_tocss9"/>
+      <w:bookmarkStart w:id="8" w:name="_Toc226359951"/>
+      <w:bookmarkStart w:id="9" w:name="_Toc227134781"/>
       <w:r>
         <w:rPr>
           <w:rFonts w:ascii="Aptos" w:hAnsi="Aptos"/>
@@ -3944,9 +3664,9 @@
         </w:rPr>
         <w:t>Bill of Material</w:t>
       </w:r>
-      <w:bookmarkEnd w:id="6"/>
       <w:bookmarkEnd w:id="7"/>
       <w:bookmarkEnd w:id="8"/>
+      <w:bookmarkEnd w:id="9"/>
     </w:p>
     <w:p>
       <w:pPr>
@@ -4060,21 +3780,7 @@
               <w:rPr>
                 <w:rFonts w:ascii="Aptos" w:hAnsi="Aptos"/>
               </w:rPr>
-              <w:t xml:space="preserve">019258 - OTTO 1500 Custom </w:t>
-            </w:r>
-            <w:proofErr w:type="spellStart"/>
-            <w:r>
-              <w:rPr>
-                <w:rFonts w:ascii="Aptos" w:hAnsi="Aptos"/>
-              </w:rPr>
-              <w:t>Fieldset</w:t>
-            </w:r>
-            <w:proofErr w:type="spellEnd"/>
-            <w:r>
-              <w:rPr>
-                <w:rFonts w:ascii="Aptos" w:hAnsi="Aptos"/>
-              </w:rPr>
-              <w:t xml:space="preserve"> Configuration</w:t>
+              <w:t>019258 - OTTO 1500 Custom Fieldset Configuration</w:t>
             </w:r>
           </w:p>
         </w:tc>
@@ -4270,8 +3976,8 @@
           <w:szCs w:val="32"/>
         </w:rPr>
       </w:pPr>
-      <w:bookmarkStart w:id="9" w:name="_tocs3"/>
-      <w:bookmarkStart w:id="10" w:name="_Toc226359952"/>
+      <w:bookmarkStart w:id="10" w:name="_tocs3"/>
+      <w:bookmarkStart w:id="11" w:name="_Toc226359952"/>
     </w:p>
     <w:p>
       <w:pPr>
@@ -4310,7 +4016,7 @@
           <w:rFonts w:ascii="Aptos Narrow" w:hAnsi="Aptos Narrow" w:cs="Arial"/>
         </w:rPr>
       </w:pPr>
-      <w:bookmarkStart w:id="11" w:name="_Toc227134782"/>
+      <w:bookmarkStart w:id="12" w:name="_Toc227134782"/>
       <w:r>
         <w:rPr>
           <w:rFonts w:ascii="Aptos" w:hAnsi="Aptos"/>
@@ -4343,9 +4049,9 @@
         </w:rPr>
         <w:t xml:space="preserve"> Summary</w:t>
       </w:r>
-      <w:bookmarkEnd w:id="9"/>
       <w:bookmarkEnd w:id="10"/>
       <w:bookmarkEnd w:id="11"/>
+      <w:bookmarkEnd w:id="12"/>
     </w:p>
     <w:p>
       <w:r>
@@ -4353,23 +4059,7 @@
           <w:rFonts w:ascii="Aptos" w:hAnsi="Aptos"/>
           <w:color w:val="1A1A2E"/>
         </w:rPr>
-        <w:t xml:space="preserve">Prices do not include sales, use, </w:t>
-      </w:r>
-      <w:proofErr w:type="gramStart"/>
-      <w:r>
-        <w:rPr>
-          <w:rFonts w:ascii="Aptos" w:hAnsi="Aptos"/>
-          <w:color w:val="1A1A2E"/>
-        </w:rPr>
-        <w:t>excise</w:t>
-      </w:r>
-      <w:proofErr w:type="gramEnd"/>
-      <w:r>
-        <w:rPr>
-          <w:rFonts w:ascii="Aptos" w:hAnsi="Aptos"/>
-          <w:color w:val="1A1A2E"/>
-        </w:rPr>
-        <w:t>, customs, value-added, tariff, duty, or similar taxes. Buyer will pay or reimburse Seller for all such</w:t>
+        <w:t>Prices do not include sales, use, excise, customs, value-added, tariff, duty, or similar taxes. Buyer will pay or reimburse Seller for all such</w:t>
       </w:r>
       <w:r>
         <w:t xml:space="preserve"> </w:t>
@@ -4420,9 +4110,9 @@
           <w:rFonts w:ascii="Aptos Narrow" w:hAnsi="Aptos Narrow" w:cs="Arial"/>
         </w:rPr>
       </w:pPr>
-      <w:bookmarkStart w:id="12" w:name="_tocss10"/>
-      <w:bookmarkStart w:id="13" w:name="_Toc226359953"/>
-      <w:bookmarkStart w:id="14" w:name="_Toc227134783"/>
+      <w:bookmarkStart w:id="13" w:name="_tocss10"/>
+      <w:bookmarkStart w:id="14" w:name="_Toc226359953"/>
+      <w:bookmarkStart w:id="15" w:name="_Toc227134783"/>
       <w:r>
         <w:rPr>
           <w:rFonts w:ascii="Aptos" w:hAnsi="Aptos"/>
@@ -4487,9 +4177,9 @@
         </w:rPr>
         <w:t xml:space="preserve"> of Sale</w:t>
       </w:r>
-      <w:bookmarkEnd w:id="12"/>
       <w:bookmarkEnd w:id="13"/>
       <w:bookmarkEnd w:id="14"/>
+      <w:bookmarkEnd w:id="15"/>
     </w:p>
     <w:p>
       <w:r>
@@ -4527,9 +4217,9 @@
           <w:rFonts w:ascii="Aptos Narrow" w:hAnsi="Aptos Narrow" w:cs="Arial"/>
         </w:rPr>
       </w:pPr>
-      <w:bookmarkStart w:id="15" w:name="_tocss11"/>
-      <w:bookmarkStart w:id="16" w:name="_Toc226359954"/>
-      <w:bookmarkStart w:id="17" w:name="_Toc227134784"/>
+      <w:bookmarkStart w:id="16" w:name="_tocss11"/>
+      <w:bookmarkStart w:id="17" w:name="_Toc226359954"/>
+      <w:bookmarkStart w:id="18" w:name="_Toc227134784"/>
       <w:r>
         <w:rPr>
           <w:rFonts w:ascii="Aptos" w:hAnsi="Aptos"/>
@@ -4595,9 +4285,9 @@
         </w:rPr>
         <w:t xml:space="preserve"> Terms</w:t>
       </w:r>
-      <w:bookmarkEnd w:id="15"/>
       <w:bookmarkEnd w:id="16"/>
       <w:bookmarkEnd w:id="17"/>
+      <w:bookmarkEnd w:id="18"/>
     </w:p>
     <w:p>
       <w:r>
@@ -5077,8 +4767,8 @@
           <w:szCs w:val="32"/>
         </w:rPr>
       </w:pPr>
-      <w:bookmarkStart w:id="18" w:name="_tocs6"/>
-      <w:bookmarkStart w:id="19" w:name="_Toc226359955"/>
+      <w:bookmarkStart w:id="19" w:name="_tocs6"/>
+      <w:bookmarkStart w:id="20" w:name="_Toc226359955"/>
     </w:p>
     <w:p>
       <w:pPr>
@@ -5117,7 +4807,7 @@
           <w:rFonts w:ascii="Aptos Narrow" w:hAnsi="Aptos Narrow" w:cs="Arial"/>
         </w:rPr>
       </w:pPr>
-      <w:bookmarkStart w:id="20" w:name="_Toc227134785"/>
+      <w:bookmarkStart w:id="21" w:name="_Toc227134785"/>
       <w:r>
         <w:rPr>
           <w:rFonts w:ascii="Aptos" w:hAnsi="Aptos"/>
@@ -5150,9 +4840,9 @@
         </w:rPr>
         <w:t xml:space="preserve"> Time</w:t>
       </w:r>
-      <w:bookmarkEnd w:id="18"/>
       <w:bookmarkEnd w:id="19"/>
       <w:bookmarkEnd w:id="20"/>
+      <w:bookmarkEnd w:id="21"/>
     </w:p>
     <w:p>
       <w:r>
@@ -5200,9 +4890,9 @@
           <w:rFonts w:ascii="Aptos Narrow" w:hAnsi="Aptos Narrow" w:cs="Arial"/>
         </w:rPr>
       </w:pPr>
-      <w:bookmarkStart w:id="21" w:name="_tocs7"/>
-      <w:bookmarkStart w:id="22" w:name="_Toc226359956"/>
-      <w:bookmarkStart w:id="23" w:name="_Toc227134786"/>
+      <w:bookmarkStart w:id="22" w:name="_tocs7"/>
+      <w:bookmarkStart w:id="23" w:name="_Toc226359956"/>
+      <w:bookmarkStart w:id="24" w:name="_Toc227134786"/>
       <w:r>
         <w:rPr>
           <w:rFonts w:ascii="Aptos" w:hAnsi="Aptos"/>
@@ -5224,9 +4914,9 @@
         </w:rPr>
         <w:t>Delivery Terms</w:t>
       </w:r>
-      <w:bookmarkEnd w:id="21"/>
       <w:bookmarkEnd w:id="22"/>
       <w:bookmarkEnd w:id="23"/>
+      <w:bookmarkEnd w:id="24"/>
     </w:p>
     <w:p>
       <w:r>
@@ -5298,8 +4988,8 @@
           <w:szCs w:val="32"/>
         </w:rPr>
       </w:pPr>
-      <w:bookmarkStart w:id="24" w:name="_tocss12"/>
-      <w:bookmarkStart w:id="25" w:name="_Toc226359957"/>
+      <w:bookmarkStart w:id="25" w:name="_tocss12"/>
+      <w:bookmarkStart w:id="26" w:name="_Toc226359957"/>
     </w:p>
     <w:p>
       <w:pPr>
@@ -5506,7 +5196,7 @@
           <w:rFonts w:ascii="Aptos Narrow" w:hAnsi="Aptos Narrow" w:cs="Arial"/>
         </w:rPr>
       </w:pPr>
-      <w:bookmarkStart w:id="26" w:name="_Toc227134787"/>
+      <w:bookmarkStart w:id="27" w:name="_Toc227134787"/>
       <w:r>
         <w:rPr>
           <w:rFonts w:ascii="Aptos" w:hAnsi="Aptos"/>
@@ -5515,11 +5205,10 @@
           <w:sz w:val="32"/>
           <w:szCs w:val="32"/>
         </w:rPr>
-        <w:lastRenderedPageBreak/>
         <w:t>8</w:t>
       </w:r>
-      <w:bookmarkEnd w:id="24"/>
       <w:bookmarkEnd w:id="25"/>
+      <w:bookmarkEnd w:id="26"/>
       <w:r>
         <w:rPr>
           <w:rFonts w:ascii="Aptos" w:hAnsi="Aptos"/>
@@ -5563,7 +5252,7 @@
         </w:rPr>
         <w:t>Assumptions</w:t>
       </w:r>
-      <w:bookmarkEnd w:id="26"/>
+      <w:bookmarkEnd w:id="27"/>
     </w:p>
     <w:p>
       <w:r>
@@ -5571,6 +5260,7 @@
           <w:rFonts w:ascii="Aptos" w:hAnsi="Aptos"/>
           <w:color w:val="1A1A2E"/>
         </w:rPr>
+        <w:lastRenderedPageBreak/>
         <w:t>(1) This quotation is based upon information provided by the customer that is summarized in Seller's Project Input Presentation or Statement of Work. If any operational parameters</w:t>
       </w:r>
       <w:r>
@@ -5581,23 +5271,7 @@
           <w:rFonts w:ascii="Aptos" w:hAnsi="Aptos"/>
           <w:color w:val="1A1A2E"/>
         </w:rPr>
-        <w:t xml:space="preserve">change from what was originally reviewed, the quote becomes void, and the project will need to be reevaluated. Any changes included but </w:t>
-      </w:r>
-      <w:proofErr w:type="gramStart"/>
-      <w:r>
-        <w:rPr>
-          <w:rFonts w:ascii="Aptos" w:hAnsi="Aptos"/>
-          <w:color w:val="1A1A2E"/>
-        </w:rPr>
-        <w:t>not</w:t>
-      </w:r>
-      <w:proofErr w:type="gramEnd"/>
-      <w:r>
-        <w:rPr>
-          <w:rFonts w:ascii="Aptos" w:hAnsi="Aptos"/>
-          <w:color w:val="1A1A2E"/>
-        </w:rPr>
-        <w:t xml:space="preserve"> limited to any operational</w:t>
+        <w:t>change from what was originally reviewed, the quote becomes void, and the project will need to be reevaluated. Any changes included but not limited to any operational</w:t>
       </w:r>
       <w:r>
         <w:t xml:space="preserve"> </w:t>
@@ -5839,21 +5513,7 @@
               <w:rPr>
                 <w:rFonts w:ascii="Aptos" w:hAnsi="Aptos"/>
               </w:rPr>
-              <w:t xml:space="preserve">All notices must be received in writing </w:t>
-            </w:r>
-            <w:proofErr w:type="gramStart"/>
-            <w:r>
-              <w:rPr>
-                <w:rFonts w:ascii="Aptos" w:hAnsi="Aptos"/>
-              </w:rPr>
-              <w:t>per</w:t>
-            </w:r>
-            <w:proofErr w:type="gramEnd"/>
-            <w:r>
-              <w:rPr>
-                <w:rFonts w:ascii="Aptos" w:hAnsi="Aptos"/>
-              </w:rPr>
-              <w:t xml:space="preserve"> the above timelines</w:t>
+              <w:t>All notices must be received in writing per the above timelines</w:t>
             </w:r>
           </w:p>
         </w:tc>
@@ -5966,18 +5626,10 @@
           <w:rFonts w:ascii="Aptos" w:hAnsi="Aptos"/>
           <w:color w:val="1A1A2E"/>
         </w:rPr>
-        <w:t xml:space="preserve">understanding that it may not be disclosed to third parties </w:t>
+        <w:t>understanding that it may not be disclosed to third parties or reproduced or used, in whole or in part, for any purpose other than evaluation of this document.</w:t>
       </w:r>
-      <w:r>
-        <w:rPr>
-          <w:rFonts w:ascii="Aptos" w:hAnsi="Aptos"/>
-          <w:color w:val="1A1A2E"/>
-        </w:rPr>
-        <w:lastRenderedPageBreak/>
-        <w:t>or reproduced or used, in whole or in part, for any purpose other than evaluation of this document.</w:t>
-      </w:r>
-      <w:bookmarkStart w:id="27" w:name="_tocss13"/>
-      <w:bookmarkStart w:id="28" w:name="_Toc226359958"/>
+      <w:bookmarkStart w:id="28" w:name="_tocss13"/>
+      <w:bookmarkStart w:id="29" w:name="_Toc226359958"/>
     </w:p>
     <w:p>
       <w:pPr>
@@ -5990,7 +5642,7 @@
           <w:u w:val="single"/>
         </w:rPr>
       </w:pPr>
-      <w:bookmarkStart w:id="29" w:name="_Toc227134788"/>
+      <w:bookmarkStart w:id="30" w:name="_Toc227134788"/>
       <w:r>
         <w:rPr>
           <w:rFonts w:ascii="Aptos" w:hAnsi="Aptos"/>
@@ -6034,9 +5686,9 @@
         </w:rPr>
         <w:t xml:space="preserve"> Conditions</w:t>
       </w:r>
-      <w:bookmarkEnd w:id="27"/>
       <w:bookmarkEnd w:id="28"/>
       <w:bookmarkEnd w:id="29"/>
+      <w:bookmarkEnd w:id="30"/>
     </w:p>
     <w:p>
       <w:pPr>
@@ -6057,6 +5709,7 @@
           <w:rFonts w:ascii="Aptos" w:eastAsia="Aptos" w:hAnsi="Aptos" w:cs="Aptos"/>
           <w:color w:val="000000"/>
         </w:rPr>
+        <w:lastRenderedPageBreak/>
         <w:t xml:space="preserve">The sale of products and services by Seller is subject to Seller's general terms and conditions of sale ("Seller's Terms") as attached to this document or as otherwise posted on Seller's website at </w:t>
       </w:r>
       <w:hyperlink r:id="rId19" w:history="1">
@@ -6087,9 +5740,9 @@
           <w:u w:val="single"/>
         </w:rPr>
       </w:pPr>
-      <w:bookmarkStart w:id="30" w:name="_tocss14"/>
-      <w:bookmarkStart w:id="31" w:name="_Toc226359959"/>
-      <w:bookmarkStart w:id="32" w:name="_Toc227134789"/>
+      <w:bookmarkStart w:id="31" w:name="_tocss14"/>
+      <w:bookmarkStart w:id="32" w:name="_Toc226359959"/>
+      <w:bookmarkStart w:id="33" w:name="_Toc227134789"/>
       <w:r>
         <w:rPr>
           <w:rFonts w:ascii="Aptos" w:hAnsi="Aptos"/>
@@ -6111,9 +5764,9 @@
         </w:rPr>
         <w:t xml:space="preserve"> and Intellectual Property</w:t>
       </w:r>
-      <w:bookmarkEnd w:id="30"/>
       <w:bookmarkEnd w:id="31"/>
       <w:bookmarkEnd w:id="32"/>
+      <w:bookmarkEnd w:id="33"/>
     </w:p>
     <w:p>
       <w:pPr>
@@ -6139,21 +5792,7 @@
         <w:rPr>
           <w:rFonts w:ascii="Aptos" w:eastAsia="Aptos" w:hAnsi="Aptos" w:cs="Aptos"/>
         </w:rPr>
-        <w:t xml:space="preserve">McNaughton-McKay Electrical Company and buyer agree that the deliverables developed while under contract is to be considered a compilation and thus the complete deliverables </w:t>
-      </w:r>
-      <w:proofErr w:type="gramStart"/>
-      <w:r>
-        <w:rPr>
-          <w:rFonts w:ascii="Aptos" w:eastAsia="Aptos" w:hAnsi="Aptos" w:cs="Aptos"/>
-        </w:rPr>
-        <w:t>as a whole are</w:t>
-      </w:r>
-      <w:proofErr w:type="gramEnd"/>
-      <w:r>
-        <w:rPr>
-          <w:rFonts w:ascii="Aptos" w:eastAsia="Aptos" w:hAnsi="Aptos" w:cs="Aptos"/>
-        </w:rPr>
-        <w:t xml:space="preserve"> considered a “work made for hire” as defined in 17 U.S.C. § 101. The Client acknowledges and agrees that the Work and the Services performed by McNaughton-McKay Electrical Company Technologies may include modules, components, designs, software, programs, utilities, subsets, objects, program listings, tools, models, methodologies, programs, systems, analysis frameworks, leading practices and specifications owned or developed by McNaughton-McKay Electrical Company ("Contractor Materials") prior to, and during its engagement with Client. McNaughton-McKay Electrical Company retains all rights, title, and interest in and to such Contractor Materials, and the same shall not be considered “Work” or a “work made for hire” and shall not be assigned to or belong to Client; provided, however, that after receipt of final payment for services provided, McNaughton-McKay Electrical Company shall deliver to Client an irrevocable, non-transferable, non-exclusive license to use and modify the Contractor Materials for the Client’s purposes onl</w:t>
+        <w:t>McNaughton-McKay Electrical Company and buyer agree that the deliverables developed while under contract is to be considered a compilation and thus the complete deliverables as a whole are considered a “work made for hire” as defined in 17 U.S.C. § 101. The Client acknowledges and agrees that the Work and the Services performed by McNaughton-McKay Electrical Company Technologies may include modules, components, designs, software, programs, utilities, subsets, objects, program listings, tools, models, methodologies, programs, systems, analysis frameworks, leading practices and specifications owned or developed by McNaughton-McKay Electrical Company ("Contractor Materials") prior to, and during its engagement with Client. McNaughton-McKay Electrical Company retains all rights, title, and interest in and to such Contractor Materials, and the same shall not be considered “Work” or a “work made for hire” and shall not be assigned to or belong to Client; provided, however, that after receipt of final payment for services provided, McNaughton-McKay Electrical Company shall deliver to Client an irrevocable, non-transferable, non-exclusive license to use and modify the Contractor Materials for the Client’s purposes onl</w:t>
       </w:r>
       <w:r>
         <w:rPr>
@@ -6454,83 +6093,6 @@
 
 <file path=word/header2.xml><?xml version="1.0" encoding="utf-8"?>
 <w:hdr xmlns:wpc="http://schemas.microsoft.com/office/word/2010/wordprocessingCanvas" xmlns:cx="http://schemas.microsoft.com/office/drawing/2014/chartex" xmlns:cx1="http://schemas.microsoft.com/office/drawing/2015/9/8/chartex" xmlns:cx2="http://schemas.microsoft.com/office/drawing/2015/10/21/chartex" xmlns:cx3="http://schemas.microsoft.com/office/drawing/2016/5/9/chartex" xmlns:cx4="http://schemas.microsoft.com/office/drawing/2016/5/10/chartex" xmlns:cx5="http://schemas.microsoft.com/office/drawing/2016/5/11/chartex" xmlns:cx6="http://schemas.microsoft.com/office/drawing/2016/5/12/chartex" xmlns:cx7="http://schemas.microsoft.com/office/drawing/2016/5/13/chartex" xmlns:cx8="http://schemas.microsoft.com/office/drawing/2016/5/14/chartex" xmlns:mc="http://schemas.openxmlformats.org/markup-compatibility/2006" xmlns:aink="http://schemas.microsoft.com/office/drawing/2016/ink" xmlns:am3d="http://schemas.microsoft.com/office/drawing/2017/model3d" xmlns:o="urn:schemas-microsoft-com:office:office" xmlns:oel="http://schemas.microsoft.com/office/2019/extlst" xmlns:r="http://schemas.openxmlformats.org/officeDocument/2006/relationships" xmlns:m="http://schemas.openxmlformats.org/officeDocument/2006/math" xmlns:v="urn:schemas-microsoft-com:vml" xmlns:wp14="http://schemas.microsoft.com/office/word/2010/wordprocessingDrawing" xmlns:wp="http://schemas.openxmlformats.org/drawingml/2006/wordprocessingDrawing" xmlns:w10="urn:schemas-microsoft-com:office:word" xmlns:w="http://schemas.openxmlformats.org/wordprocessingml/2006/main" xmlns:w14="http://schemas.microsoft.com/office/word/2010/wordml" xmlns:w15="http://schemas.microsoft.com/office/word/2012/wordml" xmlns:w16cex="http://schemas.microsoft.com/office/word/2018/wordml/cex" xmlns:w16cid="http://schemas.microsoft.com/office/word/2016/wordml/cid" xmlns:w16="http://schemas.microsoft.com/office/word/2018/wordml" xmlns:w16du="http://schemas.microsoft.com/office/word/2023/wordml/word16du" xmlns:w16sdtdh="http://schemas.microsoft.com/office/word/2020/wordml/sdtdatahash" xmlns:w16sdtfl="http://schemas.microsoft.com/office/word/2024/wordml/sdtformatlock" xmlns:w16se="http://schemas.microsoft.com/office/word/2015/wordml/symex" xmlns:wpg="http://schemas.microsoft.com/office/word/2010/wordprocessingGroup" xmlns:wpi="http://schemas.microsoft.com/office/word/2010/wordprocessingInk" xmlns:wne="http://schemas.microsoft.com/office/word/2006/wordml" xmlns:wps="http://schemas.microsoft.com/office/word/2010/wordprocessingShape" mc:Ignorable="w14 w15 w16se w16cid w16 w16cex w16sdtdh w16sdtfl w16du wp14">
-  <w:sdt>
-    <w:sdtPr>
-      <w:rPr>
-        <w:rFonts w:ascii="Aptos" w:eastAsia="Aptos" w:hAnsi="Aptos" w:cs="Aptos"/>
-        <w:b/>
-        <w:bCs/>
-      </w:rPr>
-      <w:id w:val="1695959929"/>
-      <w:docPartObj>
-        <w:docPartGallery w:val="Watermarks"/>
-        <w:docPartUnique/>
-      </w:docPartObj>
-    </w:sdtPr>
-    <w:sdtContent>
-      <w:p>
-        <w:pPr>
-          <w:pBdr>
-            <w:top w:val="nil"/>
-            <w:left w:val="nil"/>
-            <w:bottom w:val="nil"/>
-            <w:right w:val="nil"/>
-            <w:between w:val="nil"/>
-          </w:pBdr>
-          <w:tabs>
-            <w:tab w:val="center" w:pos="4680"/>
-            <w:tab w:val="right" w:pos="9360"/>
-          </w:tabs>
-          <w:spacing w:after="0" w:line="240" w:lineRule="auto"/>
-          <w:jc w:val="right"/>
-          <w:rPr>
-            <w:rFonts w:ascii="Aptos" w:eastAsia="Aptos" w:hAnsi="Aptos" w:cs="Aptos"/>
-            <w:b/>
-            <w:bCs/>
-          </w:rPr>
-        </w:pPr>
-        <w:r>
-          <w:rPr>
-            <w:rFonts w:ascii="Aptos" w:eastAsia="Aptos" w:hAnsi="Aptos" w:cs="Aptos"/>
-            <w:b/>
-            <w:bCs/>
-            <w:noProof/>
-          </w:rPr>
-          <w:pict w14:anchorId="10993DDA">
-            <v:shapetype id="_x0000_t136" coordsize="21600,21600" o:spt="136" adj="10800" path="m@7,l@8,m@5,21600l@6,21600e">
-              <v:formulas>
-                <v:f eqn="sum #0 0 10800"/>
-                <v:f eqn="prod #0 2 1"/>
-                <v:f eqn="sum 21600 0 @1"/>
-                <v:f eqn="sum 0 0 @2"/>
-                <v:f eqn="sum 21600 0 @3"/>
-                <v:f eqn="if @0 @3 0"/>
-                <v:f eqn="if @0 21600 @1"/>
-                <v:f eqn="if @0 0 @2"/>
-                <v:f eqn="if @0 @4 21600"/>
-                <v:f eqn="mid @5 @6"/>
-                <v:f eqn="mid @8 @5"/>
-                <v:f eqn="mid @7 @8"/>
-                <v:f eqn="mid @6 @7"/>
-                <v:f eqn="sum @6 0 @5"/>
-              </v:formulas>
-              <v:path textpathok="t" o:connecttype="custom" o:connectlocs="@9,0;@10,10800;@11,21600;@12,10800" o:connectangles="270,180,90,0"/>
-              <v:textpath on="t" fitshape="t"/>
-              <v:handles>
-                <v:h position="#0,bottomRight" xrange="6629,14971"/>
-              </v:handles>
-              <o:lock v:ext="edit" text="t" shapetype="t"/>
-            </v:shapetype>
-            <v:shape id="PowerPlusWaterMarkObject105031314" o:spid="_x0000_s1025" type="#_x0000_t136" style="position:absolute;left:0;text-align:left;margin-left:0;margin-top:0;width:494.9pt;height:164.95pt;rotation:315;z-index:-251657728;mso-position-horizontal:center;mso-position-horizontal-relative:margin;mso-position-vertical:center;mso-position-vertical-relative:margin" o:allowincell="f" fillcolor="silver" stroked="f">
-              <v:fill opacity=".5"/>
-              <v:textpath style="font-family:&quot;Calibri&quot;;font-size:1pt" string="BUDGETARY"/>
-              <w10:wrap anchorx="margin" anchory="margin"/>
-            </v:shape>
-          </w:pict>
-        </w:r>
-      </w:p>
-    </w:sdtContent>
-  </w:sdt>
   <w:p>
     <w:pPr>
       <w:pBdr>
@@ -6610,25 +6172,7 @@
         <w:b/>
         <w:bCs/>
       </w:rPr>
-      <w:t>{{</w:t>
-    </w:r>
-    <w:proofErr w:type="spellStart"/>
-    <w:r>
-      <w:rPr>
-        <w:rFonts w:ascii="Aptos" w:eastAsia="Aptos" w:hAnsi="Aptos" w:cs="Aptos"/>
-        <w:b/>
-        <w:bCs/>
-      </w:rPr>
-      <w:t>customer_name</w:t>
-    </w:r>
-    <w:proofErr w:type="spellEnd"/>
-    <w:r>
-      <w:rPr>
-        <w:rFonts w:ascii="Aptos" w:eastAsia="Aptos" w:hAnsi="Aptos" w:cs="Aptos"/>
-        <w:b/>
-        <w:bCs/>
-      </w:rPr>
-      <w:t>}}</w:t>
+      <w:t>{{customer_name}}</w:t>
     </w:r>
     <w:r>
       <w:rPr>
@@ -6644,23 +6188,7 @@
         <w:rFonts w:ascii="Aptos" w:eastAsia="Aptos" w:hAnsi="Aptos" w:cs="Aptos"/>
         <w:color w:val="000000"/>
       </w:rPr>
-      <w:t>{{</w:t>
-    </w:r>
-    <w:proofErr w:type="spellStart"/>
-    <w:r>
-      <w:rPr>
-        <w:rFonts w:ascii="Aptos" w:eastAsia="Aptos" w:hAnsi="Aptos" w:cs="Aptos"/>
-        <w:color w:val="000000"/>
-      </w:rPr>
-      <w:t>proposal_number</w:t>
-    </w:r>
-    <w:proofErr w:type="spellEnd"/>
-    <w:r>
-      <w:rPr>
-        <w:rFonts w:ascii="Aptos" w:eastAsia="Aptos" w:hAnsi="Aptos" w:cs="Aptos"/>
-        <w:color w:val="000000"/>
-      </w:rPr>
-      <w:t>}}</w:t>
+      <w:t>{{proposal_number}}</w:t>
     </w:r>
   </w:p>
   <w:p>
@@ -11928,37 +11456,6 @@
 </file>
 
 <file path=customXml/item1.xml><?xml version="1.0" encoding="utf-8"?>
-<p:properties xmlns:p="http://schemas.microsoft.com/office/2006/metadata/properties" xmlns:xsi="http://www.w3.org/2001/XMLSchema-instance" xmlns:pc="http://schemas.microsoft.com/office/infopath/2007/PartnerControls">
-  <documentManagement>
-    <TaxCatchAll xmlns="1240a608-ab0c-4b9e-a7e8-98b322547dfc" xsi:nil="true"/>
-    <lcf76f155ced4ddcb4097134ff3c332f xmlns="17280a2b-37da-44d9-bded-03910e228e5a">
-      <Terms xmlns="http://schemas.microsoft.com/office/infopath/2007/PartnerControls"/>
-    </lcf76f155ced4ddcb4097134ff3c332f>
-    <LastEdited xmlns="17280a2b-37da-44d9-bded-03910e228e5a">
-      <UserInfo>
-        <DisplayName/>
-        <AccountId xsi:nil="true"/>
-        <AccountType/>
-      </UserInfo>
-    </LastEdited>
-  </documentManagement>
-</p:properties>
-</file>
-
-<file path=customXml/item2.xml><?xml version="1.0" encoding="utf-8"?>
-<?mso-contentType ?>
-<FormTemplates xmlns="http://schemas.microsoft.com/sharepoint/v3/contenttype/forms">
-  <Display>DocumentLibraryForm</Display>
-  <Edit>DocumentLibraryForm</Edit>
-  <New>DocumentLibraryForm</New>
-</FormTemplates>
-</file>
-
-<file path=customXml/item3.xml><?xml version="1.0" encoding="utf-8"?>
-<b:Sources xmlns:b="http://schemas.openxmlformats.org/officeDocument/2006/bibliography" xmlns="http://schemas.openxmlformats.org/officeDocument/2006/bibliography" SelectedStyle="\APASixthEditionOfficeOnline.xsl" StyleName="APA" Version="6"/>
-</file>
-
-<file path=customXml/item4.xml><?xml version="1.0" encoding="utf-8"?>
 <ct:contentTypeSchema xmlns:ct="http://schemas.microsoft.com/office/2006/metadata/contentType" xmlns:ma="http://schemas.microsoft.com/office/2006/metadata/properties/metaAttributes" ct:_="" ma:_="" ma:contentTypeName="Document" ma:contentTypeID="0x01010091DC0C81704971498909B37128C6313A" ma:contentTypeVersion="20" ma:contentTypeDescription="Create a new document." ma:contentTypeScope="" ma:versionID="e565a2cacd807b31cd07b8d522cae671">
   <xsd:schema xmlns:xsd="http://www.w3.org/2001/XMLSchema" xmlns:xs="http://www.w3.org/2001/XMLSchema" xmlns:p="http://schemas.microsoft.com/office/2006/metadata/properties" xmlns:ns2="17280a2b-37da-44d9-bded-03910e228e5a" xmlns:ns3="1240a608-ab0c-4b9e-a7e8-98b322547dfc" targetNamespace="http://schemas.microsoft.com/office/2006/metadata/properties" ma:root="true" ma:fieldsID="0110d707138436e12cbb4669245872c4" ns2:_="" ns3:_="">
     <xsd:import namespace="17280a2b-37da-44d9-bded-03910e228e5a"/>
@@ -12239,34 +11736,38 @@
 </ct:contentTypeSchema>
 </file>
 
-<file path=customXml/itemProps1.xml><?xml version="1.0" encoding="utf-8"?>
-<ds:datastoreItem xmlns:ds="http://schemas.openxmlformats.org/officeDocument/2006/customXml" ds:itemID="{198F2852-3330-4053-9879-43F29ED4AB86}">
-  <ds:schemaRefs>
-    <ds:schemaRef ds:uri="http://schemas.microsoft.com/office/2006/metadata/properties"/>
-    <ds:schemaRef ds:uri="http://schemas.microsoft.com/office/infopath/2007/PartnerControls"/>
-    <ds:schemaRef ds:uri="1240a608-ab0c-4b9e-a7e8-98b322547dfc"/>
-    <ds:schemaRef ds:uri="17280a2b-37da-44d9-bded-03910e228e5a"/>
-  </ds:schemaRefs>
-</ds:datastoreItem>
+<file path=customXml/item2.xml><?xml version="1.0" encoding="utf-8"?>
+<b:Sources xmlns:b="http://schemas.openxmlformats.org/officeDocument/2006/bibliography" xmlns="http://schemas.openxmlformats.org/officeDocument/2006/bibliography" SelectedStyle="\APASixthEditionOfficeOnline.xsl" StyleName="APA" Version="6"/>
 </file>
 
-<file path=customXml/itemProps2.xml><?xml version="1.0" encoding="utf-8"?>
-<ds:datastoreItem xmlns:ds="http://schemas.openxmlformats.org/officeDocument/2006/customXml" ds:itemID="{5B4036AD-D8C8-419D-BFFE-96A2DC0D267F}">
-  <ds:schemaRefs>
-    <ds:schemaRef ds:uri="http://schemas.microsoft.com/sharepoint/v3/contenttype/forms"/>
-  </ds:schemaRefs>
-</ds:datastoreItem>
+<file path=customXml/item3.xml><?xml version="1.0" encoding="utf-8"?>
+<?mso-contentType ?>
+<FormTemplates xmlns="http://schemas.microsoft.com/sharepoint/v3/contenttype/forms">
+  <Display>DocumentLibraryForm</Display>
+  <Edit>DocumentLibraryForm</Edit>
+  <New>DocumentLibraryForm</New>
+</FormTemplates>
 </file>
 
-<file path=customXml/itemProps3.xml><?xml version="1.0" encoding="utf-8"?>
-<ds:datastoreItem xmlns:ds="http://schemas.openxmlformats.org/officeDocument/2006/customXml" ds:itemID="{019E14DF-1C9B-43A7-814A-E736EE78D25A}">
-  <ds:schemaRefs>
-    <ds:schemaRef ds:uri="http://schemas.openxmlformats.org/officeDocument/2006/bibliography"/>
-  </ds:schemaRefs>
-</ds:datastoreItem>
+<file path=customXml/item4.xml><?xml version="1.0" encoding="utf-8"?>
+<p:properties xmlns:p="http://schemas.microsoft.com/office/2006/metadata/properties" xmlns:xsi="http://www.w3.org/2001/XMLSchema-instance" xmlns:pc="http://schemas.microsoft.com/office/infopath/2007/PartnerControls">
+  <documentManagement>
+    <TaxCatchAll xmlns="1240a608-ab0c-4b9e-a7e8-98b322547dfc" xsi:nil="true"/>
+    <lcf76f155ced4ddcb4097134ff3c332f xmlns="17280a2b-37da-44d9-bded-03910e228e5a">
+      <Terms xmlns="http://schemas.microsoft.com/office/infopath/2007/PartnerControls"/>
+    </lcf76f155ced4ddcb4097134ff3c332f>
+    <LastEdited xmlns="17280a2b-37da-44d9-bded-03910e228e5a">
+      <UserInfo>
+        <DisplayName/>
+        <AccountId xsi:nil="true"/>
+        <AccountType/>
+      </UserInfo>
+    </LastEdited>
+  </documentManagement>
+</p:properties>
 </file>
 
-<file path=customXml/itemProps4.xml><?xml version="1.0" encoding="utf-8"?>
+<file path=customXml/itemProps1.xml><?xml version="1.0" encoding="utf-8"?>
 <ds:datastoreItem xmlns:ds="http://schemas.openxmlformats.org/officeDocument/2006/customXml" ds:itemID="{3ACD135F-19EF-4809-846A-B652A325CBFC}">
   <ds:schemaRefs>
     <ds:schemaRef ds:uri="http://schemas.microsoft.com/office/2006/metadata/contentType"/>
@@ -12285,6 +11786,33 @@
 </ds:datastoreItem>
 </file>
 
+<file path=customXml/itemProps2.xml><?xml version="1.0" encoding="utf-8"?>
+<ds:datastoreItem xmlns:ds="http://schemas.openxmlformats.org/officeDocument/2006/customXml" ds:itemID="{019E14DF-1C9B-43A7-814A-E736EE78D25A}">
+  <ds:schemaRefs>
+    <ds:schemaRef ds:uri="http://schemas.openxmlformats.org/officeDocument/2006/bibliography"/>
+  </ds:schemaRefs>
+</ds:datastoreItem>
+</file>
+
+<file path=customXml/itemProps3.xml><?xml version="1.0" encoding="utf-8"?>
+<ds:datastoreItem xmlns:ds="http://schemas.openxmlformats.org/officeDocument/2006/customXml" ds:itemID="{5B4036AD-D8C8-419D-BFFE-96A2DC0D267F}">
+  <ds:schemaRefs>
+    <ds:schemaRef ds:uri="http://schemas.microsoft.com/sharepoint/v3/contenttype/forms"/>
+  </ds:schemaRefs>
+</ds:datastoreItem>
+</file>
+
+<file path=customXml/itemProps4.xml><?xml version="1.0" encoding="utf-8"?>
+<ds:datastoreItem xmlns:ds="http://schemas.openxmlformats.org/officeDocument/2006/customXml" ds:itemID="{198F2852-3330-4053-9879-43F29ED4AB86}">
+  <ds:schemaRefs>
+    <ds:schemaRef ds:uri="http://schemas.microsoft.com/office/2006/metadata/properties"/>
+    <ds:schemaRef ds:uri="http://schemas.microsoft.com/office/infopath/2007/PartnerControls"/>
+    <ds:schemaRef ds:uri="1240a608-ab0c-4b9e-a7e8-98b322547dfc"/>
+    <ds:schemaRef ds:uri="17280a2b-37da-44d9-bded-03910e228e5a"/>
+  </ds:schemaRefs>
+</ds:datastoreItem>
+</file>
+
 <file path=docMetadata/LabelInfo.xml><?xml version="1.0" encoding="utf-8"?>
 <clbl:labelList xmlns:clbl="http://schemas.microsoft.com/office/2020/mipLabelMetadata">
   <clbl:label id="{c5d04ce6-c381-45a5-bb15-1f1d4a5e6746}" enabled="0" method="" siteId="{c5d04ce6-c381-45a5-bb15-1f1d4a5e6746}" removed="1"/>

</xml_diff>